<commit_message>
Notify Teams when a satellite marks a transfer Paid in Store
Melissa reported (Sept 18 2026, Chris/Ruben thread) that Seminole took cash
from a patient but Erie had no signal that payment cleared, so the box sat
for a week and a prescriber called about it. The Mark Paid in Store button
already logs an audit event; now it also posts to the shared satellite-Erie
Teams chat via /api/notify-teams so the fill side sees the payment landed
and knows the transfer is cleared to ship.

Fires from both entry points (inline dollar button on the Transfers list
and the modal Mark Paid in Store button). Same chatWebhookKey routing as
the other notifications — Tabz auto-payments still go through the healnow
webhook path, unchanged, since those already sync payment status directly.
</commit_message>
<xml_diff>
--- a/PI-Transfer-Tracker-Getting-Started.docx
+++ b/PI-Transfer-Tracker-Getting-Started.docx
@@ -4,6 +4,45 @@
   <w:body>
     <w:p>
       <w:pPr>
+        <w:jc w:val="center"/>
+      </w:pPr>
+      <w:r>
+        <w:drawing>
+          <wp:inline xmlns:a="http://schemas.openxmlformats.org/drawingml/2006/main" xmlns:pic="http://schemas.openxmlformats.org/drawingml/2006/picture">
+            <wp:extent cx="2286000" cy="537210"/>
+            <wp:docPr id="1" name="Picture 1"/>
+            <wp:cNvGraphicFramePr>
+              <a:graphicFrameLocks noChangeAspect="1"/>
+            </wp:cNvGraphicFramePr>
+            <a:graphic>
+              <a:graphicData uri="http://schemas.openxmlformats.org/drawingml/2006/picture">
+                <pic:pic>
+                  <pic:nvPicPr>
+                    <pic:cNvPr id="0" name="Pharmacy Innovations landscape logo.png"/>
+                    <pic:cNvPicPr/>
+                  </pic:nvPicPr>
+                  <pic:blipFill>
+                    <a:blip r:embed="rId7"/>
+                    <a:stretch>
+                      <a:fillRect/>
+                    </a:stretch>
+                  </pic:blipFill>
+                  <pic:spPr>
+                    <a:xfrm>
+                      <a:off x="0" y="0"/>
+                      <a:ext cx="2286000" cy="537210"/>
+                    </a:xfrm>
+                    <a:prstGeom prst="rect"/>
+                  </pic:spPr>
+                </pic:pic>
+              </a:graphicData>
+            </a:graphic>
+          </wp:inline>
+        </w:drawing>
+      </w:r>
+    </w:p>
+    <w:p>
+      <w:pPr>
         <w:pStyle w:val="Heading1"/>
         <w:rPr>
           <w:rFonts w:ascii="Segoe UI" w:eastAsia="Times New Roman" w:hAnsi="Segoe UI" w:cs="Segoe UI"/>
@@ -218,6 +257,24 @@
           <w:lang w:val="en"/>
         </w:rPr>
         <w:t xml:space="preserve"> in the top navbar</w:t>
+      </w:r>
+    </w:p>
+    <w:p>
+      <w:r>
+        <w:rPr>
+          <w:b/>
+        </w:rPr>
+        <w:t xml:space="preserve">📹 Training video: </w:t>
+      </w:r>
+      <w:r>
+        <w:rPr>
+          <w:color w:val="2A6EBB"/>
+          <w:u w:val="single"/>
+        </w:rPr>
+        <w:t>Watch the PI Transfer Tracker training video</w:t>
+      </w:r>
+      <w:r>
+        <w:t xml:space="preserve"> (https://pharmacyinnovationsnet-my.sharepoint.com/:v:/g/personal/abrown_pharmacyinnovations_net/IQA6K8ip3Nb4RY_wDcr6xUseARyBqqddL3X1hHSt98geshE?e=YfQb55) — ~10 min screen-recorded walkthrough of the most common tasks. Watch this first before your day-one setup.</w:t>
       </w:r>
     </w:p>
     <w:p>

</xml_diff>